<commit_message>
fix(register): Lektorat-Punkte 1–11 umgesetzt (v6)
Aus dem Original-Abgleich (LEKTORAT_v6.md):
- Fehler: HCH 38 „Sʿd“→„ʾsd“ (Original ʾs¹d); C 4803 „Ḍkr“→„Ḏkr“ (ḏ≠ḍ).
- Götternamen eingedeutscht: HSNS 5 „Dšry/Lt“→„Duschara/Allat“;
  C 4803 „Bʿlsmn“→„Baalschamin“; Is.Mu 255 „Jaʾlat“→„Yalt“.
- flṭ vereinheitlicht: C 134 „Befreiung“→„Errettung“; MKJS 80 „nimm die
  Not“→„errette aus der Not“.
- Fluch-Vollständigkeit: Is.Mu 242 + „Und blende, wer dies blind macht.“
  (Parallelstein LP 461); KRS 941 + „Allat — blende, wer die Schrift blind
  macht.“
- s¹lm einheitlich „Sicherheit“ (statt „gib Sicherheit“/„dass er sicher sei“).

Docx neu gebaut und verifiziert. D + E (Diakritika/Philologie) noch offen.

Co-Authored-By: Claude Opus 4.8 <noreply@anthropic.com>
Claude-Session: https://claude.ai/code/session_014bcwQ5jz9EH6bJZQXZEKgN
</commit_message>
<xml_diff>
--- a/safaitic-research/Poetics/register/wer_dies_liest_register_v6.docx
+++ b/safaitic-research/Poetics/register/wer_dies_liest_register_v6.docx
@@ -408,7 +408,7 @@
         <w:spacing w:after="40"/>
       </w:pPr>
       <w:r>
-        <w:t xml:space="preserve">Von Sʿd, Sohn des Ẓn, Sohn des Ṯlm.</w:t>
+        <w:t xml:space="preserve">Von ʾsd, Sohn des Ẓn, Sohn des Ṯlm.</w:t>
       </w:r>
     </w:p>
     <w:p>
@@ -1388,7 +1388,7 @@
         <w:spacing w:after="40"/>
       </w:pPr>
       <w:r>
-        <w:t xml:space="preserve">Jaʾlat — gib Sicherheit.</w:t>
+        <w:t xml:space="preserve">Yalt — Sicherheit.</w:t>
       </w:r>
     </w:p>
     <w:p>
@@ -2785,7 +2785,7 @@
         <w:spacing w:after="40"/>
       </w:pPr>
       <w:r>
-        <w:t xml:space="preserve">und nimm die Not.</w:t>
+        <w:t xml:space="preserve">und errette aus der Not.</w:t>
       </w:r>
     </w:p>
     <w:p>
@@ -2896,7 +2896,7 @@
         <w:spacing w:after="40"/>
       </w:pPr>
       <w:r>
-        <w:t xml:space="preserve">Allat — gib Sicherheit.</w:t>
+        <w:t xml:space="preserve">Allat — Sicherheit.</w:t>
       </w:r>
     </w:p>
     <w:p>
@@ -2954,7 +2954,7 @@
         <w:spacing w:after="40"/>
       </w:pPr>
       <w:r>
-        <w:t xml:space="preserve">gib Sicherheit.</w:t>
+        <w:t xml:space="preserve">Sicherheit.</w:t>
       </w:r>
     </w:p>
     <w:p>
@@ -2983,7 +2983,7 @@
         <w:spacing w:after="40"/>
       </w:pPr>
       <w:r>
-        <w:t xml:space="preserve">schenke Befreiung.</w:t>
+        <w:t xml:space="preserve">schenk Errettung.</w:t>
       </w:r>
     </w:p>
     <w:p>
@@ -3070,7 +3070,7 @@
         <w:spacing w:after="40"/>
       </w:pPr>
       <w:r>
-        <w:t xml:space="preserve">dass er sicher sei.</w:t>
+        <w:t xml:space="preserve">Sicherheit.</w:t>
       </w:r>
     </w:p>
     <w:p>
@@ -3099,7 +3099,7 @@
         <w:spacing w:after="40"/>
       </w:pPr>
       <w:r>
-        <w:t xml:space="preserve">dass er sicher sei,</w:t>
+        <w:t xml:space="preserve">Sicherheit,</w:t>
       </w:r>
     </w:p>
     <w:p>
@@ -3136,7 +3136,7 @@
         <w:spacing w:after="40"/>
       </w:pPr>
       <w:r>
-        <w:t xml:space="preserve">dass er sicher sei.</w:t>
+        <w:t xml:space="preserve">Sicherheit.</w:t>
       </w:r>
     </w:p>
     <w:p>
@@ -3165,7 +3165,7 @@
         <w:spacing w:after="40"/>
       </w:pPr>
       <w:r>
-        <w:t xml:space="preserve">Allat — dass er sicher sei.</w:t>
+        <w:t xml:space="preserve">Allat — Sicherheit.</w:t>
       </w:r>
     </w:p>
     <w:p>
@@ -3194,7 +3194,7 @@
         <w:spacing w:after="40"/>
       </w:pPr>
       <w:r>
-        <w:t xml:space="preserve">Allat — dass er sicher sei.</w:t>
+        <w:t xml:space="preserve">Allat — Sicherheit.</w:t>
       </w:r>
     </w:p>
     <w:p>
@@ -3297,7 +3297,7 @@
         <w:spacing w:after="40"/>
       </w:pPr>
       <w:r>
-        <w:t xml:space="preserve">dass er sicher sei.</w:t>
+        <w:t xml:space="preserve">Sicherheit.</w:t>
       </w:r>
     </w:p>
     <w:p>
@@ -4028,7 +4028,7 @@
         <w:spacing w:after="40"/>
       </w:pPr>
       <w:r>
-        <w:t xml:space="preserve">Von ʾlwhb, Sohn des Zmr, Sohn des Ḍkr.</w:t>
+        <w:t xml:space="preserve">Von ʾlwhb, Sohn des Zmr, Sohn des Ḏkr.</w:t>
       </w:r>
     </w:p>
     <w:p>
@@ -4052,7 +4052,7 @@
         <w:spacing w:after="40"/>
       </w:pPr>
       <w:r>
-        <w:t xml:space="preserve">Bʿlsmn — gib Sicherheit,</w:t>
+        <w:t xml:space="preserve">Baalschamin — gib Sicherheit,</w:t>
       </w:r>
     </w:p>
     <w:p>
@@ -4301,6 +4301,14 @@
     </w:p>
     <w:p>
       <w:pPr>
+        <w:spacing w:after="40"/>
+      </w:pPr>
+      <w:r>
+        <w:t xml:space="preserve">Und blende, wer dies blind macht.</w:t>
+      </w:r>
+    </w:p>
+    <w:p>
+      <w:pPr>
         <w:spacing w:before="260" w:after="40"/>
       </w:pPr>
       <w:r>
@@ -4485,6 +4493,22 @@
       </w:pPr>
       <w:r>
         <w:t xml:space="preserve">wer überlebt, verzweifelt.</w:t>
+      </w:r>
+    </w:p>
+    <w:p>
+      <w:pPr>
+        <w:spacing w:after="40"/>
+      </w:pPr>
+      <w:r>
+        <w:t xml:space="preserve">Allat —</w:t>
+      </w:r>
+    </w:p>
+    <w:p>
+      <w:pPr>
+        <w:spacing w:after="40"/>
+      </w:pPr>
+      <w:r>
+        <w:t xml:space="preserve">blende, wer die Schrift blind macht.</w:t>
       </w:r>
     </w:p>
     <w:p>
@@ -4847,7 +4871,7 @@
         <w:spacing w:after="40"/>
       </w:pPr>
       <w:r>
-        <w:t xml:space="preserve">Dšry und Lt:</w:t>
+        <w:t xml:space="preserve">Duschara und Allat:</w:t>
       </w:r>
     </w:p>
     <w:p>

</xml_diff>

<commit_message>
Lektorat v6: Punkte 12–17 umgesetzt (Diakritika, Oheim-Differenzierung, Rache/Römer)
- 12 JaS 15: Bnġdw → Bnġḍw (emphatisches ḍ, Original bnġḍw)
- 13 HCH 125: Kst → Ksṭ (emphatisches ṭ, ks¹ṭ; vgl. C 2775)
- 14 RQ.D 3: „den Oheim, den sie erschlugen" → „die Mutter, die getötet
  wurde" (Original ʾm -h qtlt, feminine Form)
- 15 LP 243: Rache-Anrufung „Lh — Blutrache!" ergänzt (f h ylh ṯʾr)
- 16 RQ.D 6: „im Jahr der Rm" → „im Jahr der Römer" (Bandkonvention für rm)
- 17 Oheim differenziert: SIJ 291 → Mutterbruder (ḫzʾ/ḫl, mütterlich);
  RSIS 351, LP 243, C 2190 → Vaterbruder (dd, väterlich). „Oheim" 0× im Band.

LEKTORAT_v6.md: Umsetzungsstand auf 1–17 gezogen; Ausschnitt-Übersicht
ergänzt (5 inhaltliche Ausschnitte von 138 Stücken, Rest vollständig).

Co-Authored-By: Claude Opus 4.8 <noreply@anthropic.com>
Claude-Session: https://claude.ai/code/session_014bcwQ5jz9EH6bJZQXZEKgN
</commit_message>
<xml_diff>
--- a/safaitic-research/Poetics/register/wer_dies_liest_register_v6.docx
+++ b/safaitic-research/Poetics/register/wer_dies_liest_register_v6.docx
@@ -284,7 +284,7 @@
         <w:spacing w:after="40"/>
       </w:pPr>
       <w:r>
-        <w:t xml:space="preserve">Von Ḥmr, Sohn des Bnġdw,</w:t>
+        <w:t xml:space="preserve">Von Ḥmr, Sohn des Bnġḍw,</w:t>
       </w:r>
     </w:p>
     <w:p>
@@ -842,7 +842,7 @@
         <w:spacing w:after="40"/>
       </w:pPr>
       <w:r>
-        <w:t xml:space="preserve">und er schrieb für den Oheim,</w:t>
+        <w:t xml:space="preserve">und er schrieb für den Mutterbruder,</w:t>
       </w:r>
     </w:p>
     <w:p>
@@ -2293,7 +2293,7 @@
         <w:spacing w:after="40"/>
       </w:pPr>
       <w:r>
-        <w:t xml:space="preserve">Sohn des Kst, Sohn des ʿbd …</w:t>
+        <w:t xml:space="preserve">Sohn des Ksṭ, Sohn des ʿbd …</w:t>
       </w:r>
     </w:p>
     <w:p>
@@ -4142,7 +4142,7 @@
         <w:spacing w:after="40"/>
       </w:pPr>
       <w:r>
-        <w:t xml:space="preserve">und weinte um den Vater, um ʿbd, um den Oheim,</w:t>
+        <w:t xml:space="preserve">und weinte um den Vater, um ʿbd, um den Vaterbruder,</w:t>
       </w:r>
     </w:p>
     <w:p>
@@ -4235,7 +4235,15 @@
         <w:spacing w:after="40"/>
       </w:pPr>
       <w:r>
-        <w:t xml:space="preserve">Er sehnte sich nach dem Oheim</w:t>
+        <w:t xml:space="preserve">Lh — Blutrache!</w:t>
+      </w:r>
+    </w:p>
+    <w:p>
+      <w:pPr>
+        <w:spacing w:after="40"/>
+      </w:pPr>
+      <w:r>
+        <w:t xml:space="preserve">Er sehnte sich nach dem Vaterbruder</w:t>
       </w:r>
     </w:p>
     <w:p>
@@ -5173,15 +5181,15 @@
         <w:spacing w:after="40"/>
       </w:pPr>
       <w:r>
-        <w:t xml:space="preserve">Er trauerte um den Oheim,</w:t>
-      </w:r>
-    </w:p>
-    <w:p>
-      <w:pPr>
-        <w:spacing w:after="40"/>
-      </w:pPr>
-      <w:r>
-        <w:t xml:space="preserve">den sie erschlugen,</w:t>
+        <w:t xml:space="preserve">Er trauerte um die Mutter,</w:t>
+      </w:r>
+    </w:p>
+    <w:p>
+      <w:pPr>
+        <w:spacing w:after="40"/>
+      </w:pPr>
+      <w:r>
+        <w:t xml:space="preserve">die getötet wurde,</w:t>
       </w:r>
     </w:p>
     <w:p>
@@ -5234,7 +5242,7 @@
         <w:spacing w:after="40"/>
       </w:pPr>
       <w:r>
-        <w:t xml:space="preserve">im Jahr der Rm.</w:t>
+        <w:t xml:space="preserve">im Jahr der Römer.</w:t>
       </w:r>
     </w:p>
     <w:p>
@@ -5300,7 +5308,7 @@
         <w:spacing w:after="40"/>
       </w:pPr>
       <w:r>
-        <w:t xml:space="preserve">im Jahr, als der Oheim starb,</w:t>
+        <w:t xml:space="preserve">im Jahr, als der Vaterbruder starb,</w:t>
       </w:r>
     </w:p>
     <w:p>

</xml_diff>

<commit_message>
Lektorat v6: fünf gekürzte Inschriften vollständig ausführen
Die zuvor bewusst gekürzten Stücke RSIS 110, RSIS 322, LP 1196, KRS 17
und C 2551 geben jetzt den vollen Inhalt des Originals wieder — die
getilgten Anrufungen, Namenslisten und Fluchklauseln sind in Bandstil
ergänzt (Götternamen eingedeutscht, s¹lm → „Sicherheit", ʿwr-Fluch in
etablierter Formel). Damit verbleibt kein inhaltlicher Ausschnitt mehr;
nur die registerkonforme Genealogie-Kürzung bleibt.

Punkt 17 (Oheim) nach Originalwort differenziert: ḫzʾ/ḫl → Mutterbruder
(SIJ 291); dd → Vaterbruder (RSIS 351, LP 243, C 2190); ʾm/qtlt → Mutter
(RQ.D 3). Punkte 12–16 eingearbeitet (Bnġḍw, Ksṭ, LP-243-Rachezeile,
Jahr der Römer). LEKTORAT_v6.md und Skript nachgezogen, v6 neu gebaut.

Co-Authored-By: Claude Opus 4.8 <noreply@anthropic.com>
Claude-Session: https://claude.ai/code/session_014bcwQ5jz9EH6bJZQXZEKgN
</commit_message>
<xml_diff>
--- a/safaitic-research/Poetics/register/wer_dies_liest_register_v6.docx
+++ b/safaitic-research/Poetics/register/wer_dies_liest_register_v6.docx
@@ -1306,7 +1306,15 @@
         <w:spacing w:after="40"/>
       </w:pPr>
       <w:r>
-        <w:t xml:space="preserve">Er war an diesem Ort</w:t>
+        <w:t xml:space="preserve">Er trauerte um den Vater</w:t>
+      </w:r>
+    </w:p>
+    <w:p>
+      <w:pPr>
+        <w:spacing w:after="40"/>
+      </w:pPr>
+      <w:r>
+        <w:t xml:space="preserve">und blieb an diesem Ort</w:t>
       </w:r>
     </w:p>
     <w:p>
@@ -1327,6 +1335,22 @@
     </w:p>
     <w:p>
       <w:pPr>
+        <w:spacing w:after="40"/>
+      </w:pPr>
+      <w:r>
+        <w:t xml:space="preserve">Allat —</w:t>
+      </w:r>
+    </w:p>
+    <w:p>
+      <w:pPr>
+        <w:spacing w:after="40"/>
+      </w:pPr>
+      <w:r>
+        <w:t xml:space="preserve">Sicherheit und Fülle dem, der die Schrift achtet.</w:t>
+      </w:r>
+    </w:p>
+    <w:p>
+      <w:pPr>
         <w:spacing w:before="260" w:after="40"/>
       </w:pPr>
       <w:r>
@@ -1356,6 +1380,14 @@
     </w:p>
     <w:p>
       <w:pPr>
+        <w:spacing w:after="40"/>
+      </w:pPr>
+      <w:r>
+        <w:t xml:space="preserve">Allat — Schutz.</w:t>
+      </w:r>
+    </w:p>
+    <w:p>
+      <w:pPr>
         <w:spacing w:before="260" w:after="40"/>
       </w:pPr>
       <w:r>
@@ -1516,6 +1548,22 @@
       </w:pPr>
       <w:r>
         <w:t xml:space="preserve">nach dem Reiterzug.</w:t>
+      </w:r>
+    </w:p>
+    <w:p>
+      <w:pPr>
+        <w:spacing w:after="40"/>
+      </w:pPr>
+      <w:r>
+        <w:t xml:space="preserve">Yalt —</w:t>
+      </w:r>
+    </w:p>
+    <w:p>
+      <w:pPr>
+        <w:spacing w:after="40"/>
+      </w:pPr>
+      <w:r>
+        <w:t xml:space="preserve">Sicherheit und Beute, dem Feind abgenommen.</w:t>
       </w:r>
     </w:p>
     <w:p>
@@ -3443,6 +3491,22 @@
         <w:spacing w:after="40"/>
       </w:pPr>
       <w:r>
+        <w:t xml:space="preserve">im Jahr des Kampfes des Mʿṣ,</w:t>
+      </w:r>
+    </w:p>
+    <w:p>
+      <w:pPr>
+        <w:spacing w:after="40"/>
+      </w:pPr>
+      <w:r>
+        <w:t xml:space="preserve">und trauerte um Rb, um Yʿly, um ----ḥ,</w:t>
+      </w:r>
+    </w:p>
+    <w:p>
+      <w:pPr>
+        <w:spacing w:after="40"/>
+      </w:pPr>
+      <w:r>
         <w:t xml:space="preserve">und wurde schwer.</w:t>
       </w:r>
     </w:p>
@@ -3933,7 +3997,15 @@
         <w:spacing w:after="40"/>
       </w:pPr>
       <w:r>
-        <w:t xml:space="preserve">Rache an dem, der die Tat beging.</w:t>
+        <w:t xml:space="preserve">Rache an dem, der die Tat beging,</w:t>
+      </w:r>
+    </w:p>
+    <w:p>
+      <w:pPr>
+        <w:spacing w:after="40"/>
+      </w:pPr>
+      <w:r>
+        <w:t xml:space="preserve">und blende, wer dies blind macht.</w:t>
       </w:r>
     </w:p>
     <w:p>

</xml_diff>

<commit_message>
Band: Aussprache-Übersicht der Sonderzeichen am Bandende ergänzen
Neuer Schluss-Abschnitt „Zur Aussprache": Übersicht aller nicht aus dem
Deutschen ableitbaren Umschriftzeichen (ʾ ʿ ḥ ḫ ġ š ǧ ṯ ḏ, die
emphatischen ṣ ḍ ṭ ẓ und die Langvokale ā ī ū ō) mit Laut und
Aussprachehilfe. Als Datenblock ZEICHEN_HEAD/ZEICHEN_INTRO/ZEICHEN im
Skript, in main() nach den Fundorten emittiert; v6 neu gebaut
(idempotent). Doku nachgezogen.

Co-Authored-By: Claude Opus 4.8 <noreply@anthropic.com>
Claude-Session: https://claude.ai/code/session_014bcwQ5jz9EH6bJZQXZEKgN
</commit_message>
<xml_diff>
--- a/safaitic-research/Poetics/register/wer_dies_liest_register_v6.docx
+++ b/safaitic-research/Poetics/register/wer_dies_liest_register_v6.docx
@@ -6077,6 +6077,182 @@
       </w:r>
       <w:r>
         <w:t xml:space="preserve">: keine Ortsangabe im OCIANA-Eintrag.</w:t>
+      </w:r>
+    </w:p>
+    <w:p/>
+    <w:p>
+      <w:pPr>
+        <w:spacing w:before="200" w:after="80"/>
+      </w:pPr>
+      <w:r>
+        <w:rPr>
+          <w:b/>
+          <w:sz w:val="24"/>
+          <w:szCs w:val="24"/>
+        </w:rPr>
+        <w:t xml:space="preserve">Zur Aussprache</w:t>
+      </w:r>
+    </w:p>
+    <w:p>
+      <w:pPr>
+        <w:spacing w:after="200" w:line="320" w:lineRule="auto"/>
+      </w:pPr>
+      <w:r>
+        <w:t xml:space="preserve">Die Namen und Wörter dieses Bandes bewahren die Sonderzeichen der wissenschaftlichen Umschrift. Sie halten Laute fest, die das deutsche Alphabet nicht kennt. Die folgende Übersicht nennt zu jedem Zeichen den Laut und eine Aussprachehilfe. Großbuchstaben (Ḥ, Ṣ, Š …) klingen wie ihre kleinen Formen; die Punkte und Striche gehören zum Buchstaben und werden nicht eigens gesprochen.</w:t>
+      </w:r>
+    </w:p>
+    <w:p>
+      <w:pPr>
+        <w:spacing w:after="120" w:line="300" w:lineRule="auto"/>
+      </w:pPr>
+      <w:r>
+        <w:rPr>
+          <w:b/>
+        </w:rPr>
+        <w:t xml:space="preserve">ʾ</w:t>
+      </w:r>
+      <w:r>
+        <w:t xml:space="preserve"> — Stimmabsatz (Hamza): der harte Stimmeinsatz wie zwischen den Silben von „be·achten"; ein Knacklaut, kein Buchstabe im deutschen Sinn.</w:t>
+      </w:r>
+    </w:p>
+    <w:p>
+      <w:pPr>
+        <w:spacing w:after="120" w:line="300" w:lineRule="auto"/>
+      </w:pPr>
+      <w:r>
+        <w:rPr>
+          <w:b/>
+        </w:rPr>
+        <w:t xml:space="preserve">ʿ</w:t>
+      </w:r>
+      <w:r>
+        <w:t xml:space="preserve"> — Kehllaut (ʿAin): ein stimmhafter Presslaut tief im Rachen, ohne deutsche Entsprechung; wie ein gepresstes „a".</w:t>
+      </w:r>
+    </w:p>
+    <w:p>
+      <w:pPr>
+        <w:spacing w:after="120" w:line="300" w:lineRule="auto"/>
+      </w:pPr>
+      <w:r>
+        <w:rPr>
+          <w:b/>
+        </w:rPr>
+        <w:t xml:space="preserve">ḥ</w:t>
+      </w:r>
+      <w:r>
+        <w:t xml:space="preserve"> — scharf gehauchtes „h": aus dem Rachen gepresst, kräftiger und rauer als das deutsche h.</w:t>
+      </w:r>
+    </w:p>
+    <w:p>
+      <w:pPr>
+        <w:spacing w:after="120" w:line="300" w:lineRule="auto"/>
+      </w:pPr>
+      <w:r>
+        <w:rPr>
+          <w:b/>
+        </w:rPr>
+        <w:t xml:space="preserve">ḫ</w:t>
+      </w:r>
+      <w:r>
+        <w:t xml:space="preserve"> — Reibe-„ch": wie das ch in „Bach" oder „Buch".</w:t>
+      </w:r>
+    </w:p>
+    <w:p>
+      <w:pPr>
+        <w:spacing w:after="120" w:line="300" w:lineRule="auto"/>
+      </w:pPr>
+      <w:r>
+        <w:rPr>
+          <w:b/>
+        </w:rPr>
+        <w:t xml:space="preserve">ġ</w:t>
+      </w:r>
+      <w:r>
+        <w:t xml:space="preserve"> — Reibe-„g/r" (Ġain): ein gerolltes Zäpfchen-r, ähnlich dem französischen „r" in „Paris".</w:t>
+      </w:r>
+    </w:p>
+    <w:p>
+      <w:pPr>
+        <w:spacing w:after="120" w:line="300" w:lineRule="auto"/>
+      </w:pPr>
+      <w:r>
+        <w:rPr>
+          <w:b/>
+        </w:rPr>
+        <w:t xml:space="preserve">š</w:t>
+      </w:r>
+      <w:r>
+        <w:t xml:space="preserve"> — „sch": wie in „Schrift".</w:t>
+      </w:r>
+    </w:p>
+    <w:p>
+      <w:pPr>
+        <w:spacing w:after="120" w:line="300" w:lineRule="auto"/>
+      </w:pPr>
+      <w:r>
+        <w:rPr>
+          <w:b/>
+        </w:rPr>
+        <w:t xml:space="preserve">ǧ</w:t>
+      </w:r>
+      <w:r>
+        <w:t xml:space="preserve"> — weiches „dsch": wie das englische j in „jump" (in Ortsnamen, z. B. Riǧm, Raǧil).</w:t>
+      </w:r>
+    </w:p>
+    <w:p>
+      <w:pPr>
+        <w:spacing w:after="120" w:line="300" w:lineRule="auto"/>
+      </w:pPr>
+      <w:r>
+        <w:rPr>
+          <w:b/>
+        </w:rPr>
+        <w:t xml:space="preserve">ṯ</w:t>
+      </w:r>
+      <w:r>
+        <w:t xml:space="preserve"> — stimmloses englisches „th": wie in „think".</w:t>
+      </w:r>
+    </w:p>
+    <w:p>
+      <w:pPr>
+        <w:spacing w:after="120" w:line="300" w:lineRule="auto"/>
+      </w:pPr>
+      <w:r>
+        <w:rPr>
+          <w:b/>
+        </w:rPr>
+        <w:t xml:space="preserve">ḏ</w:t>
+      </w:r>
+      <w:r>
+        <w:t xml:space="preserve"> — stimmhaftes englisches „th": wie in „this".</w:t>
+      </w:r>
+    </w:p>
+    <w:p>
+      <w:pPr>
+        <w:spacing w:after="120" w:line="300" w:lineRule="auto"/>
+      </w:pPr>
+      <w:r>
+        <w:rPr>
+          <w:b/>
+        </w:rPr>
+        <w:t xml:space="preserve">ṣ · ḍ · ṭ · ẓ</w:t>
+      </w:r>
+      <w:r>
+        <w:t xml:space="preserve"> — nachdrückliche (emphatische) Laute: s, d, t und der „th"-/z-Laut, dunkel und mit gespannter Zunge gesprochen. Der Punkt unter dem Buchstaben markiert diese Nachdrücklichkeit.</w:t>
+      </w:r>
+    </w:p>
+    <w:p>
+      <w:pPr>
+        <w:spacing w:after="120" w:line="300" w:lineRule="auto"/>
+      </w:pPr>
+      <w:r>
+        <w:rPr>
+          <w:b/>
+        </w:rPr>
+        <w:t xml:space="preserve">ā · ī · ū · ō</w:t>
+      </w:r>
+      <w:r>
+        <w:t xml:space="preserve"> — lange Vokale: langes a, i, u, o. Sie erscheinen nur in den eingedeutschten Fund- und Personennamen (z. B. Taymāʾ, al-ʿĪsāwī, Al-Mrōshan), nicht in den vokallosen Inschriften selbst.</w:t>
       </w:r>
     </w:p>
     <w:p/>

</xml_diff>